<commit_message>
Correct the Part VIII totals to the figures I can actually show
The summary quoted 619 questions before the work and 821 after. That 619 came from an
earlier measurement with a different counting method, and I could not reproduce it.

Counted from the repository instead, before and after, as distinct question codes
appearing either as a question heading or as a rapid-fire row: 565 before, 767 now,
202 added. The per-chapter breakdown matches that total exactly.

The document now says so, and explains why the earlier figure differed, rather than
quietly swapping one number for another.

Co-Authored-By: Claude Opus 5 (1M context) <noreply@anthropic.com>
</commit_message>
<xml_diff>
--- a/review/for-abhishek/Part-VIII-predict-the-output-summary.docx
+++ b/review/for-abhishek/Part-VIII-predict-the-output-summary.docx
@@ -39,27 +39,38 @@
         <w:t>int("25", 4)</w:t>
       </w:r>
       <w:r>
-        <w:t xml:space="preserve"> kind. I measured Part VIII before starting: of its</w:t>
+        <w:t xml:space="preserve"> kind.</w:t>
+      </w:r>
+    </w:p>
+    <w:p>
+      <w:r>
+        <w:t xml:space="preserve">Measured before starting: Part VIII held </w:t>
+      </w:r>
+      <w:r>
+        <w:rPr>
+          <w:b/>
+        </w:rPr>
+        <w:t>565 coded questions</w:t>
+      </w:r>
+      <w:r>
+        <w:t xml:space="preserve"> across its banks, and </w:t>
+      </w:r>
+      <w:r>
+        <w:rPr>
+          <w:b/>
+        </w:rPr>
+        <w:t>thirteen of the fourteen banks had no predict-the-output section at all</w:t>
+      </w:r>
+      <w:r>
+        <w:t>. The only one was Chapter 72's §72.2, which is why it became the template.</w:t>
       </w:r>
     </w:p>
     <w:p>
       <w:r>
         <w:rPr>
-          <w:b/>
+          <w:i/>
         </w:rPr>
-        <w:t>619 questions, only 19 were output-prediction</w:t>
-      </w:r>
-      <w:r>
-        <w:t xml:space="preserve">, and </w:t>
-      </w:r>
-      <w:r>
-        <w:rPr>
-          <w:b/>
-        </w:rPr>
-        <w:t>17 of those 19 were in a single section</w:t>
-      </w:r>
-      <w:r>
-        <w:t xml:space="preserve"> — Chapter 72's §72.2. Thirteen of the fourteen banks had none at all.</w:t>
+        <w:t>(An earlier note of mine put the total at 619. That figure came from a different counting method and I could not reproduce it, so the numbers here are the ones I can show: distinct question codes appearing as a question heading or a rapid-fire row, counted from the repository before and after. 565 before, 767 now.)</w:t>
       </w:r>
     </w:p>
     <w:p>
@@ -80,7 +91,7 @@
         <w:rPr>
           <w:b/>
         </w:rPr>
-        <w:t>Ten new sections. 202 new questions. Part VIII goes from 619 to 821.</w:t>
+        <w:t>Ten new sections. 202 new questions. Part VIII goes from 565 coded questions to 767.</w:t>
       </w:r>
     </w:p>
     <w:tbl>

</xml_diff>

<commit_message>
Record what the structural check found across the whole chapters
My earlier claim that 'all ten pass' was scoped to the new sections. That part holds:
0 of 202 new questions is missing any required part.

Run across the whole of each chapter instead, the same script flags 37 pre-existing
questions lacking one or more part. Most are not defects -- the full walk-throughs and
design cases are deliberately a different format, and several Chapter 71 queries treat
the query as the answer -- but a handful may be genuine, Q71-060 among them.

None of them was touched. The summary now says so, with the command to reproduce the
list, rather than leaving the unqualified claim standing.

Co-Authored-By: Claude Opus 5 (1M context) <noreply@anthropic.com>
</commit_message>
<xml_diff>
--- a/review/for-abhishek/Part-VIII-predict-the-output-summary.docx
+++ b/review/for-abhishek/Part-VIII-predict-the-output-summary.docx
@@ -1019,7 +1019,58 @@
         <w:t>Learn it in</w:t>
       </w:r>
       <w:r>
-        <w:t xml:space="preserve"> pointer. A script checks that every question has all five required parts, that no code is duplicated or skipped, and that no table has a ragged row. All ten pass.</w:t>
+        <w:t xml:space="preserve"> pointer. A script (</w:t>
+      </w:r>
+      <w:r>
+        <w:rPr>
+          <w:rFonts w:ascii="Consolas" w:hAnsi="Consolas" w:eastAsia="Consolas"/>
+          <w:color w:val="8B2020"/>
+          <w:sz w:val="17"/>
+        </w:rPr>
+        <w:t>tools/review-export/check_bank.py</w:t>
+      </w:r>
+      <w:r>
+        <w:t xml:space="preserve">) checks that every question has all five required parts, that no question code is duplicated or skipped, that code fences balance and that no table has a ragged row. </w:t>
+      </w:r>
+      <w:r>
+        <w:rPr>
+          <w:b/>
+        </w:rPr>
+        <w:t>All ten new sections pass it completely — 0 of 202 new questions is missing any part.</w:t>
+      </w:r>
+    </w:p>
+    <w:p>
+      <w:r>
+        <w:t xml:space="preserve">One thing that check turned up, worth passing on. Run across the </w:t>
+      </w:r>
+      <w:r>
+        <w:rPr>
+          <w:i/>
+        </w:rPr>
+        <w:t>whole</w:t>
+      </w:r>
+      <w:r>
+        <w:t xml:space="preserve"> of each chapter rather than just the new section, it flags </w:t>
+      </w:r>
+      <w:r>
+        <w:rPr>
+          <w:b/>
+        </w:rPr>
+        <w:t>37 pre-existing questions</w:t>
+      </w:r>
+      <w:r>
+        <w:t xml:space="preserve"> that lack one or more of those parts. Most are not defects: the full walk-throughs and design cases (Q73-036, Q74-035, Q75-030, Q77-033, Q79-038, Q80-022 and their neighbours) are deliberately a different format — a talked- through scenario rather than a question with a tier table — and several Chapter 71 queries treat the query itself as the answer. A handful may be genuine gaps, Q71-060 among them. I have not touched any of them; the list is reproducible by running the script without </w:t>
+      </w:r>
+      <w:r>
+        <w:rPr>
+          <w:rFonts w:ascii="Consolas" w:hAnsi="Consolas" w:eastAsia="Consolas"/>
+          <w:color w:val="8B2020"/>
+          <w:sz w:val="17"/>
+        </w:rPr>
+        <w:t>--section</w:t>
+      </w:r>
+      <w:r>
+        <w:t>.</w:t>
       </w:r>
     </w:p>
     <w:p>

</xml_diff>